<commit_message>
docs: bring deployment guide and plain description current (v1.33.0)
Finish the full deliverable-set catch-up (technical docs included):
- Инструкция_по_развёртыванию → v1.33.0; Flyway migrations updated to V1–V6
  (adds V5 skills, V6 agile_maturity) across the start-up, manual-install and
  maintenance sections.
- Описание_Планирование_спринта_PRO.docx: regenerated text-only from the same
  section data as the illustrated description (build_illustrated.py now emits
  both), so it covers all current sections (Star Map, EDA, Agile maturity, …).

Co-Authored-By: Claude Opus 4.8 <noreply@anthropic.com>
</commit_message>
<xml_diff>
--- a/Инструкция_по_развёртыванию_Планирование_спринта_PRO.docx
+++ b/Инструкция_по_развёртыванию_Планирование_спринта_PRO.docx
@@ -36,7 +36,7 @@
           <w:i/>
           <w:sz w:val="20"/>
         </w:rPr>
-        <w:t>Планирование спринтов PRO · v1.31.0 · 17.09.2026</w:t>
+        <w:t>Планирование спринтов PRO · v1.33.0 · 17.09.2026</w:t>
       </w:r>
     </w:p>
     <w:p/>
@@ -424,7 +424,7 @@
     </w:p>
     <w:p>
       <w:r>
-        <w:t>Базы данных: planirovanie (основная, схема и сид применяются Flyway из Java-сервиса — миграции V1, V2, V3, V4) и planirovanie_audit (отдельная БД журнала событий).</w:t>
+        <w:t>Базы данных: planirovanie (основная, схема и сид применяются Flyway из Java-сервиса — миграции V1–V6) и planirovanie_audit (отдельная БД журнала событий).</w:t>
       </w:r>
     </w:p>
     <w:p>
@@ -999,7 +999,7 @@
         <w:pStyle w:val="ListNumber"/>
       </w:pPr>
       <w:r>
-        <w:t>Стартует Java-сервис (api); Flyway применяет миграции к БД planirovanie: V1 (схема + демо-данные), V2 (таблицы авторизации), V3 (release_id/priority/dor + boards), V4 (доска board_doc).</w:t>
+        <w:t>Стартует Java-сервис (api); Flyway применяет миграции к БД planirovanie: V1 (схема + демо-данные), V2 (таблицы авторизации), V3 (release_id/priority/dor + boards), V4 (доска board_doc), V5 (компетенции skills), V6 (agile_maturity).</w:t>
       </w:r>
     </w:p>
     <w:p>
@@ -1523,7 +1523,7 @@
     <w:p/>
     <w:p>
       <w:r>
-        <w:t>При старте Flyway применит миграции V1/V2/V3. Сервис слушает порт 8080. Проверка:</w:t>
+        <w:t>При старте Flyway применит миграции V1…V6. Сервис слушает порт 8080. Проверка:</w:t>
       </w:r>
     </w:p>
     <w:tbl>
@@ -2994,7 +2994,7 @@
         <w:t xml:space="preserve">Важно: </w:t>
       </w:r>
       <w:r>
-        <w:t>Не редактируйте уже применённые Flyway-миграции (V1, V2, V3) — добавляйте только новые (V4, V5, …). Для чистой установки пересоздайте БД.</w:t>
+        <w:t>Не редактируйте уже применённые Flyway-миграции (V1…V6) — добавляйте только новые (V7, …). Для чистой установки пересоздайте БД.</w:t>
       </w:r>
     </w:p>
     <w:p>

</xml_diff>

<commit_message>
feat(roles): add Product Owner + ИТ-Лидер roles; Scrum Master as an additional role (v1.36.0)
- New primary roles «Product Owner» and «ИТ-Лидер» (in ROLES, with Star Map
  competency sets); available in the team role selector, capacity/role charts
  and Star Map.
- «Скрам-мастер» is an additional role: a new team field (select Да/—) that can
  be assigned to any member alongside their primary role. Surfaced in the Team
  table, and in Star Map (SM badge on the member card + «Скрам-мастеров» KPI).
- Persistence: TeamMember.scrum + Flyway V7 (ALTER TABLE team ADD scrum);
  StateRoundTripTest asserts it round-trips. One demo member seeded as SM.
- Tests: frontend e2e 51/51, backend 7/7.
- Docs to v1.36.0: user guide (team roles + SM), admin guide (team.scrum / V7),
  deploy guide (Flyway V1–V7), illustrated (team caption); presentation (38) and
  video regenerated; Support synced.

Co-Authored-By: Claude Opus 4.8 <noreply@anthropic.com>
</commit_message>
<xml_diff>
--- a/Инструкция_по_развёртыванию_Планирование_спринта_PRO.docx
+++ b/Инструкция_по_развёртыванию_Планирование_спринта_PRO.docx
@@ -36,7 +36,7 @@
           <w:i/>
           <w:sz w:val="20"/>
         </w:rPr>
-        <w:t>Управление кросс-функциональной командой PRO · v1.35.0 · 17.09.2026</w:t>
+        <w:t>Управление кросс-функциональной командой PRO · v1.36.0 · 18.09.2026</w:t>
       </w:r>
     </w:p>
     <w:p/>
@@ -424,7 +424,7 @@
     </w:p>
     <w:p>
       <w:r>
-        <w:t>Базы данных: planirovanie (основная, схема и сид применяются Flyway из Java-сервиса — миграции V1–V6) и planirovanie_audit (отдельная БД журнала событий).</w:t>
+        <w:t>Базы данных: planirovanie (основная, схема и сид применяются Flyway из Java-сервиса — миграции V1–V7) и planirovanie_audit (отдельная БД журнала событий).</w:t>
       </w:r>
     </w:p>
     <w:p>
@@ -999,7 +999,7 @@
         <w:pStyle w:val="ListNumber"/>
       </w:pPr>
       <w:r>
-        <w:t>Стартует Java-сервис (api); Flyway применяет миграции к БД planirovanie: V1 (схема + демо-данные), V2 (таблицы авторизации), V3 (release_id/priority/dor + boards), V4 (доска board_doc), V5 (компетенции skills), V6 (agile_maturity).</w:t>
+        <w:t>Стартует Java-сервис (api); Flyway применяет миграции к БД planirovanie: V1 (схема + демо-данные), V2 (таблицы авторизации), V3 (release_id/priority/dor + boards), V4 (доска board_doc), V5 (компетенции skills), V6 (agile_maturity), V7 (team.scrum — доп. роль «Скрам-мастер»).</w:t>
       </w:r>
     </w:p>
     <w:p>
@@ -1523,7 +1523,7 @@
     <w:p/>
     <w:p>
       <w:r>
-        <w:t>При старте Flyway применит миграции V1…V6. Сервис слушает порт 8080. Проверка:</w:t>
+        <w:t>При старте Flyway применит миграции V1…V7. Сервис слушает порт 8080. Проверка:</w:t>
       </w:r>
     </w:p>
     <w:tbl>
@@ -3148,7 +3148,7 @@
         <w:t xml:space="preserve">Важно: </w:t>
       </w:r>
       <w:r>
-        <w:t>Не редактируйте уже применённые Flyway-миграции (V1…V6) — добавляйте только новые (V7, …). Для чистой установки пересоздайте БД.</w:t>
+        <w:t>Не редактируйте уже применённые Flyway-миграции (V1…V7) — добавляйте только новые (V7, …). Для чистой установки пересоздайте БД.</w:t>
       </w:r>
     </w:p>
     <w:p>

</xml_diff>

<commit_message>
feat(nav): ergonomic sidebar — collapsible groups, favorites, recent, filter (v1.37.0)
Optimizes the 35-item / 8-group menu per UX best practices:
- Collapsible groups (accordion): on first run only the active group is open,
  the rest collapsed — removes the long scroll; a chevron toggles each, state
  persists (localStorage).
- Quick filter box at the top: instantly narrows sections by name.
- «⭐ Избранное»: pin frequently used sections (star on hover); always on top.
- «🕘 Недавние»: recently opened sections.
- Compact density + sticky group headers.
Structure/paths unchanged, so docs and deep-links keep working.

Tests: frontend e2e 52/52 (+ a deep collapse/pin/filter test), version test green.
Docs to v1.37.0: user guide «Интерфейс» describes the new menu; all screenshots
re-captured with the compact sidebar; presentation (38) and video regenerated;
Support synced.

Co-Authored-By: Claude Opus 4.8 <noreply@anthropic.com>
</commit_message>
<xml_diff>
--- a/Инструкция_по_развёртыванию_Планирование_спринта_PRO.docx
+++ b/Инструкция_по_развёртыванию_Планирование_спринта_PRO.docx
@@ -36,7 +36,7 @@
           <w:i/>
           <w:sz w:val="20"/>
         </w:rPr>
-        <w:t>Управление кросс-функциональной командой PRO · v1.36.0 · 18.09.2026</w:t>
+        <w:t>Управление кросс-функциональной командой PRO · v1.37.0 · 18.09.2026</w:t>
       </w:r>
     </w:p>
     <w:p/>
@@ -129,110 +129,6 @@
     <w:p>
       <w:r>
         <w:t>Приложение — полиглот-стек из четырёх частей. Единая точка входа для пользователя — nginx (порт 8080), который отдаёт интерфейс и проксирует запросы к Java- и Python-сервисам; оба сервиса работают поверх PostgreSQL.</w:t>
-      </w:r>
-    </w:p>
-    <w:p>
-      <w:pPr>
-        <w:jc w:val="center"/>
-      </w:pPr>
-      <w:r>
-        <w:drawing>
-          <wp:inline xmlns:a="http://schemas.openxmlformats.org/drawingml/2006/main" xmlns:pic="http://schemas.openxmlformats.org/drawingml/2006/picture">
-            <wp:extent cx="5760000" cy="3799149"/>
-            <wp:docPr id="1" name="Picture 1"/>
-            <wp:cNvGraphicFramePr>
-              <a:graphicFrameLocks noChangeAspect="1"/>
-            </wp:cNvGraphicFramePr>
-            <a:graphic>
-              <a:graphicData uri="http://schemas.openxmlformats.org/drawingml/2006/picture">
-                <pic:pic>
-                  <pic:nvPicPr>
-                    <pic:cNvPr id="0" name="arch.png"/>
-                    <pic:cNvPicPr/>
-                  </pic:nvPicPr>
-                  <pic:blipFill>
-                    <a:blip r:embed="rId9"/>
-                    <a:stretch>
-                      <a:fillRect/>
-                    </a:stretch>
-                  </pic:blipFill>
-                  <pic:spPr>
-                    <a:xfrm>
-                      <a:off x="0" y="0"/>
-                      <a:ext cx="5760000" cy="3799149"/>
-                    </a:xfrm>
-                    <a:prstGeom prst="rect"/>
-                  </pic:spPr>
-                </pic:pic>
-              </a:graphicData>
-            </a:graphic>
-          </wp:inline>
-        </w:drawing>
-      </w:r>
-    </w:p>
-    <w:p>
-      <w:pPr>
-        <w:jc w:val="center"/>
-      </w:pPr>
-      <w:r>
-        <w:rPr>
-          <w:i/>
-          <w:color w:val="7A8AA0"/>
-          <w:sz w:val="19"/>
-        </w:rPr>
-        <w:t>Компоненты приложения и потоки данных</w:t>
-      </w:r>
-    </w:p>
-    <w:p>
-      <w:pPr>
-        <w:jc w:val="center"/>
-      </w:pPr>
-      <w:r>
-        <w:drawing>
-          <wp:inline xmlns:a="http://schemas.openxmlformats.org/drawingml/2006/main" xmlns:pic="http://schemas.openxmlformats.org/drawingml/2006/picture">
-            <wp:extent cx="5760000" cy="3676596"/>
-            <wp:docPr id="2" name="Picture 2"/>
-            <wp:cNvGraphicFramePr>
-              <a:graphicFrameLocks noChangeAspect="1"/>
-            </wp:cNvGraphicFramePr>
-            <a:graphic>
-              <a:graphicData uri="http://schemas.openxmlformats.org/drawingml/2006/picture">
-                <pic:pic>
-                  <pic:nvPicPr>
-                    <pic:cNvPr id="0" name="infra.png"/>
-                    <pic:cNvPicPr/>
-                  </pic:nvPicPr>
-                  <pic:blipFill>
-                    <a:blip r:embed="rId10"/>
-                    <a:stretch>
-                      <a:fillRect/>
-                    </a:stretch>
-                  </pic:blipFill>
-                  <pic:spPr>
-                    <a:xfrm>
-                      <a:off x="0" y="0"/>
-                      <a:ext cx="5760000" cy="3676596"/>
-                    </a:xfrm>
-                    <a:prstGeom prst="rect"/>
-                  </pic:spPr>
-                </pic:pic>
-              </a:graphicData>
-            </a:graphic>
-          </wp:inline>
-        </w:drawing>
-      </w:r>
-    </w:p>
-    <w:p>
-      <w:pPr>
-        <w:jc w:val="center"/>
-      </w:pPr>
-      <w:r>
-        <w:rPr>
-          <w:i/>
-          <w:color w:val="7A8AA0"/>
-          <w:sz w:val="19"/>
-        </w:rPr>
-        <w:t>Развёртывание через Docker Compose: контейнеры, порты, зависимости, том данных</w:t>
       </w:r>
     </w:p>
     <w:tbl>

</xml_diff>

<commit_message>
docs: regenerate deliverables for v1.42.0 (all PM packages)
- Excel export: +10 register sheets (change requests, issues, stakeholders,
  decisions, impediments, lessons, RACI, story map, poker, portfolio) -> 40 sheets.
- Docx: 13 new sections in description/illustrated (with screenshots), a "18. PM
  practices" chapter in the user guide, V10 notes in admin/deploy guides; version 1.42.0.
- PPTX: +7 slides (EVM, stakeholders, WBS, story map, poker, portfolio, status report) -> 49.
- Chat assistant keywords for the new sections.
Frontend e2e 87/87, backend 7/7.

Co-Authored-By: Claude Opus 4.8 <noreply@anthropic.com>
</commit_message>
<xml_diff>
--- a/Инструкция_по_развёртыванию_Планирование_спринта_PRO.docx
+++ b/Инструкция_по_развёртыванию_Планирование_спринта_PRO.docx
@@ -36,7 +36,7 @@
           <w:i/>
           <w:sz w:val="20"/>
         </w:rPr>
-        <w:t>Управление кросс-функциональной командой PRO · v1.41.0 · 05.10.2026</w:t>
+        <w:t>Управление кросс-функциональной командой PRO · v1.42.0 · 05.10.2026</w:t>
       </w:r>
     </w:p>
     <w:p/>
@@ -3740,6 +3740,15 @@
         <w:t>v1.39: при старте применяются миграции Flyway V1…V8 (V8 добавляет таблицы sprint_goals и wsjf). Миграции накатываются автоматически и идемпотентно.</w:t>
       </w:r>
     </w:p>
+    <w:p>
+      <w:pPr/>
+      <w:r>
+        <w:rPr>
+          <w:i/>
+        </w:rPr>
+        <w:t>v1.42: при старте применяются миграции Flyway V1…V10 (V10 добавляет реестры управления проектом и иерархию работ). Миграции накатываются автоматически и идемпотентно.</w:t>
+      </w:r>
+    </w:p>
     <w:sectPr>
       <w:pgSz w:w="12240" w:h="15840"/>
       <w:pgMar w:top="1440" w:right="1800" w:bottom="1440" w:left="1800" w:header="720" w:footer="720" w:gutter="0"/>

</xml_diff>

<commit_message>
docs: regenerate deliverables for v1.43.0 (team health & performance)
- Docx: 4 new sections (Bus factor, Team Health Check, DORA, Incidents) in description/
  illustrated (+screenshots), «19. Health & performance» chapter in the user guide, V11
  notes in admin/deploy; version 1.43.0.
- PPTX: +4 slides (53 total, «Итог» kept last).
- Excel: +3 register sheets (team health, deployments, incidents) -> 43 sheets.
- Synced frontend/docs (Support downloads).

Co-Authored-By: Claude Opus 4.8 <noreply@anthropic.com>
</commit_message>
<xml_diff>
--- a/Инструкция_по_развёртыванию_Планирование_спринта_PRO.docx
+++ b/Инструкция_по_развёртыванию_Планирование_спринта_PRO.docx
@@ -36,7 +36,7 @@
           <w:i/>
           <w:sz w:val="20"/>
         </w:rPr>
-        <w:t>Управление кросс-функциональной командой PRO · v1.42.0 · 05.10.2026</w:t>
+        <w:t>Управление кросс-функциональной командой PRO · v1.43.0 · 05.10.2026</w:t>
       </w:r>
     </w:p>
     <w:p/>
@@ -3749,6 +3749,15 @@
         <w:t>v1.42: при старте применяются миграции Flyway V1…V10 (V10 добавляет реестры управления проектом и иерархию работ). Миграции накатываются автоматически и идемпотентно.</w:t>
       </w:r>
     </w:p>
+    <w:p>
+      <w:pPr/>
+      <w:r>
+        <w:rPr>
+          <w:i/>
+        </w:rPr>
+        <w:t>v1.43: при старте применяются миграции Flyway V1…V11 (V11 добавляет Team Health Check, деплои и инциденты).</w:t>
+      </w:r>
+    </w:p>
     <w:sectPr>
       <w:pgSz w:w="12240" w:h="15840"/>
       <w:pgMar w:top="1440" w:right="1800" w:bottom="1440" w:left="1800" w:header="720" w:footer="720" w:gutter="0"/>

</xml_diff>